<commit_message>
theme and hf design walktrhoruh
</commit_message>
<xml_diff>
--- a/src/Layers/W1/BaseApp/Foundation/Reporting/ReportParts/HeaderFooterDesign/ExternalDefault.docx
+++ b/src/Layers/W1/BaseApp/Foundation/Reporting/ReportParts/HeaderFooterDesign/ExternalDefault.docx
@@ -856,7 +856,6 @@
           <w:rPr>
             <w:rStyle w:val="TitleChar"/>
             <w:rFonts w:cstheme="majorHAnsi"/>
-            <w:color w:val="auto"/>
           </w:rPr>
           <w:alias w:val="ReportCaption"/>
           <w:tag w:val="#BC:InsertDataItem,BCReportInformation/ReportMetadata/ReportCaption"/>
@@ -887,7 +886,6 @@
                 <w:rPr>
                   <w:rStyle w:val="TitleChar"/>
                   <w:rFonts w:cstheme="majorHAnsi"/>
-                  <w:color w:val="auto"/>
                 </w:rPr>
                 <w:t>Report Caption</w:t>
               </w:r>
@@ -998,11 +996,11 @@
                 </w:rPr>
                 <w:drawing>
                   <wp:inline distT="0" distB="0" distL="0" distR="0" wp14:anchorId="229DEBE4" wp14:editId="1F6F61CC">
-                    <wp:extent cx="2185416" cy="530352"/>
+                    <wp:extent cx="1080000" cy="1080000"/>
                     <wp:effectExtent l="0" t="0" r="5715" b="3175"/>
                     <wp:docPr id="901932688" name="Billede 1" descr="The image is a plain white background with no additional elements or details.&#10;&#10;AI-generated content may be incorrect."/>
                     <wp:cNvGraphicFramePr>
-                      <a:graphicFrameLocks xmlns:a="http://schemas.openxmlformats.org/drawingml/2006/main"/>
+                      <a:graphicFrameLocks xmlns:a="http://schemas.openxmlformats.org/drawingml/2006/main" noChangeAspect="1"/>
                     </wp:cNvGraphicFramePr>
                     <a:graphic xmlns:a="http://schemas.openxmlformats.org/drawingml/2006/main">
                       <a:graphicData uri="http://schemas.openxmlformats.org/drawingml/2006/picture">
@@ -1029,7 +1027,7 @@
                           <pic:spPr bwMode="auto">
                             <a:xfrm>
                               <a:off x="0" y="0"/>
-                              <a:ext cx="2185416" cy="530352"/>
+                              <a:ext cx="1080000" cy="1080000"/>
                             </a:xfrm>
                             <a:prstGeom prst="rect">
                               <a:avLst/>

</xml_diff>

<commit_message>
updated hf and themes
</commit_message>
<xml_diff>
--- a/src/Layers/W1/BaseApp/Foundation/Reporting/ReportParts/HeaderFooterDesign/ExternalDefault.docx
+++ b/src/Layers/W1/BaseApp/Foundation/Reporting/ReportParts/HeaderFooterDesign/ExternalDefault.docx
@@ -16,7 +16,7 @@
       <w:headerReference w:type="first" r:id="rId17"/>
       <w:footerReference w:type="first" r:id="rId18"/>
       <w:pgSz w:w="11907" w:h="16839" w:code="9"/>
-      <w:pgMar w:top="345" w:right="706" w:bottom="576" w:left="706" w:header="567" w:footer="102" w:gutter="0"/>
+      <w:pgMar w:top="576" w:right="706" w:bottom="576" w:left="706" w:header="288" w:footer="288" w:gutter="0"/>
       <w:cols w:space="708"/>
       <w:titlePg/>
       <w:docGrid w:linePitch="360"/>
@@ -79,13 +79,16 @@
     <w:tr>
       <w:trPr>
         <w:cnfStyle w:val="100000000000" w:firstRow="1" w:lastRow="0" w:firstColumn="0" w:lastColumn="0" w:oddVBand="0" w:evenVBand="0" w:oddHBand="0" w:evenHBand="0" w:firstRowFirstColumn="0" w:firstRowLastColumn="0" w:lastRowFirstColumn="0" w:lastRowLastColumn="0"/>
-        <w:trHeight w:val="284"/>
+        <w:trHeight w:val="80"/>
       </w:trPr>
       <w:tc>
         <w:tcPr>
           <w:tcW w:w="2624" w:type="dxa"/>
         </w:tcPr>
         <w:p>
+          <w:pPr>
+            <w:spacing w:line="240" w:lineRule="auto"/>
+          </w:pPr>
           <w:sdt>
             <w:sdtPr>
               <w:alias w:val="CompanyHomePageCaption"/>
@@ -94,13 +97,13 @@
               <w:placeholder>
                 <w:docPart w:val="CF68DC289354454998E7B9E61A5A8DE8"/>
               </w:placeholder>
-              <w:dataBinding w:prefixMappings="xmlns:ns0='urn:microsoft-dynamics-nav/reports/Tenant_Report_Defaults/2000000001/'" w:xpath="/ns0:NavWordReportXmlPart[1]/ns0:BCReportInformation[1]/ns0:CompanyMetadata[1]/ns0:CompanyHomePageCaption[1]" w:storeItemID="{00000000-0000-0000-0000-000000000000}"/>
+              <w:dataBinding w:prefixMappings="xmlns:ns0='urn:microsoft-dynamics-nav/reports/Tenant_Report_Defaults/2000000001/' " w:xpath="/ns0:NavWordReportXmlPart[1]/ns0:BCReportInformation[1]/ns0:CompanyMetadata[1]/ns0:CompanyHomePageCaption[1]" w:storeItemID="{20B1C7BE-CC2E-41B2-B1D5-B0B8F36428EB}"/>
               <w15:color w:val="808080"/>
               <w:text/>
             </w:sdtPr>
             <w:sdtContent>
               <w:r>
-                <w:t>Homepage</w:t>
+                <w:t>Company Home Page Caption</w:t>
               </w:r>
             </w:sdtContent>
           </w:sdt>
@@ -111,6 +114,9 @@
           <w:tcW w:w="2624" w:type="dxa"/>
         </w:tcPr>
         <w:p>
+          <w:pPr>
+            <w:spacing w:line="240" w:lineRule="auto"/>
+          </w:pPr>
           <w:sdt>
             <w:sdtPr>
               <w:alias w:val="CompanyPhoneCaption"/>
@@ -119,13 +125,13 @@
               <w:placeholder>
                 <w:docPart w:val="DAAD0FFFA6E142F295BED740101E13FF"/>
               </w:placeholder>
-              <w:dataBinding w:prefixMappings="xmlns:ns0='urn:microsoft-dynamics-nav/reports/Tenant_Report_Defaults/2000000001/'" w:xpath="/ns0:NavWordReportXmlPart[1]/ns0:BCReportInformation[1]/ns0:CompanyMetadata[1]/ns0:CompanyPhoneCaption[1]" w:storeItemID="{00000000-0000-0000-0000-000000000000}"/>
+              <w:dataBinding w:prefixMappings="xmlns:ns0='urn:microsoft-dynamics-nav/reports/Tenant_Report_Defaults/2000000001/' " w:xpath="/ns0:NavWordReportXmlPart[1]/ns0:BCReportInformation[1]/ns0:CompanyMetadata[1]/ns0:CompanyPhoneCaption[1]" w:storeItemID="{20B1C7BE-CC2E-41B2-B1D5-B0B8F36428EB}"/>
               <w15:color w:val="808080"/>
               <w:text/>
             </w:sdtPr>
             <w:sdtContent>
               <w:r>
-                <w:t>Phone No</w:t>
+                <w:t>Company Phone Caption</w:t>
               </w:r>
             </w:sdtContent>
           </w:sdt>
@@ -136,6 +142,9 @@
           <w:tcW w:w="2623" w:type="dxa"/>
         </w:tcPr>
         <w:p>
+          <w:pPr>
+            <w:spacing w:line="240" w:lineRule="auto"/>
+          </w:pPr>
           <w:sdt>
             <w:sdtPr>
               <w:alias w:val="CompanyEmailCaption"/>
@@ -144,13 +153,13 @@
               <w:placeholder>
                 <w:docPart w:val="749F1ED1B7C74786B56EBFDF9942DCEC"/>
               </w:placeholder>
-              <w:dataBinding w:prefixMappings="xmlns:ns0='urn:microsoft-dynamics-nav/reports/Tenant_Report_Defaults/2000000001/'" w:xpath="/ns0:NavWordReportXmlPart[1]/ns0:BCReportInformation[1]/ns0:CompanyMetadata[1]/ns0:CompanyEmailCaption[1]" w:storeItemID="{00000000-0000-0000-0000-000000000000}"/>
+              <w:dataBinding w:prefixMappings="xmlns:ns0='urn:microsoft-dynamics-nav/reports/Tenant_Report_Defaults/2000000001/' " w:xpath="/ns0:NavWordReportXmlPart[1]/ns0:BCReportInformation[1]/ns0:CompanyMetadata[1]/ns0:CompanyEmailCaption[1]" w:storeItemID="{20B1C7BE-CC2E-41B2-B1D5-B0B8F36428EB}"/>
               <w15:color w:val="808080"/>
               <w:text/>
             </w:sdtPr>
             <w:sdtContent>
               <w:r>
-                <w:t>Email</w:t>
+                <w:t>Company Email Caption</w:t>
               </w:r>
             </w:sdtContent>
           </w:sdt>
@@ -161,6 +170,9 @@
           <w:tcW w:w="2624" w:type="dxa"/>
         </w:tcPr>
         <w:p>
+          <w:pPr>
+            <w:spacing w:line="240" w:lineRule="auto"/>
+          </w:pPr>
           <w:sdt>
             <w:sdtPr>
               <w:alias w:val="CompanyFaxNoCaption"/>
@@ -169,13 +181,13 @@
               <w:placeholder>
                 <w:docPart w:val="7B4ED47589DA45C98252972238DEBB76"/>
               </w:placeholder>
-              <w:dataBinding w:prefixMappings="xmlns:ns0='urn:microsoft-dynamics-nav/reports/Tenant_Report_Defaults/2000000001/'" w:xpath="/ns0:NavWordReportXmlPart[1]/ns0:BCReportInformation[1]/ns0:CompanyMetadata[1]/ns0:CompanyFaxNoCaption[1]" w:storeItemID="{00000000-0000-0000-0000-000000000000}"/>
+              <w:dataBinding w:prefixMappings="xmlns:ns0='urn:microsoft-dynamics-nav/reports/Tenant_Report_Defaults/2000000001/' " w:xpath="/ns0:NavWordReportXmlPart[1]/ns0:BCReportInformation[1]/ns0:CompanyMetadata[1]/ns0:CompanyFaxNoCaption[1]" w:storeItemID="{20B1C7BE-CC2E-41B2-B1D5-B0B8F36428EB}"/>
               <w15:color w:val="808080"/>
               <w:text/>
             </w:sdtPr>
             <w:sdtContent>
               <w:r>
-                <w:t>Fax No.</w:t>
+                <w:t>Company Fax No. Caption</w:t>
               </w:r>
             </w:sdtContent>
           </w:sdt>
@@ -200,13 +212,13 @@
               <w:placeholder>
                 <w:docPart w:val="1BB04F7321904FBE87F59626F7A0DAF9"/>
               </w:placeholder>
-              <w:dataBinding w:prefixMappings="xmlns:ns0='urn:microsoft-dynamics-nav/reports/Tenant_Report_Defaults/2000000001/'" w:xpath="/ns0:NavWordReportXmlPart[1]/ns0:BCReportInformation[1]/ns0:CompanyMetadata[1]/ns0:CompanyHomePage[1]" w:storeItemID="{00000000-0000-0000-0000-000000000000}"/>
+              <w:dataBinding w:prefixMappings="xmlns:ns0='urn:microsoft-dynamics-nav/reports/Tenant_Report_Defaults/2000000001/' " w:xpath="/ns0:NavWordReportXmlPart[1]/ns0:BCReportInformation[1]/ns0:CompanyMetadata[1]/ns0:CompanyHomePage[1]" w:storeItemID="{20B1C7BE-CC2E-41B2-B1D5-B0B8F36428EB}"/>
               <w15:color w:val="808080"/>
               <w:text/>
             </w:sdtPr>
             <w:sdtContent>
               <w:r>
-                <w:t>www.cronus.dk</w:t>
+                <w:t>Company Home Page</w:t>
               </w:r>
             </w:sdtContent>
           </w:sdt>
@@ -226,13 +238,13 @@
               <w:placeholder>
                 <w:docPart w:val="2A0917C05BFA4542A342ED9F975A3500"/>
               </w:placeholder>
-              <w:dataBinding w:prefixMappings="xmlns:ns0='urn:microsoft-dynamics-nav/reports/Tenant_Report_Defaults/2000000001/'" w:xpath="/ns0:NavWordReportXmlPart[1]/ns0:BCReportInformation[1]/ns0:CompanyMetadata[1]/ns0:CompanyPhone[1]" w:storeItemID="{00000000-0000-0000-0000-000000000000}"/>
+              <w:dataBinding w:prefixMappings="xmlns:ns0='urn:microsoft-dynamics-nav/reports/Tenant_Report_Defaults/2000000001/' " w:xpath="/ns0:NavWordReportXmlPart[1]/ns0:BCReportInformation[1]/ns0:CompanyMetadata[1]/ns0:CompanyPhone[1]" w:storeItemID="{20B1C7BE-CC2E-41B2-B1D5-B0B8F36428EB}"/>
               <w15:color w:val="808080"/>
               <w:text/>
             </w:sdtPr>
             <w:sdtContent>
               <w:r>
-                <w:t>34-2345667</w:t>
+                <w:t>Company Phone</w:t>
               </w:r>
             </w:sdtContent>
           </w:sdt>
@@ -252,13 +264,13 @@
               <w:placeholder>
                 <w:docPart w:val="879A5C99C43849668575BA7FF4A42EDE"/>
               </w:placeholder>
-              <w:dataBinding w:prefixMappings="xmlns:ns0='urn:microsoft-dynamics-nav/reports/Tenant_Report_Defaults/2000000001/'" w:xpath="/ns0:NavWordReportXmlPart[1]/ns0:BCReportInformation[1]/ns0:CompanyMetadata[1]/ns0:CompanyEmail[1]" w:storeItemID="{00000000-0000-0000-0000-000000000000}"/>
+              <w:dataBinding w:prefixMappings="xmlns:ns0='urn:microsoft-dynamics-nav/reports/Tenant_Report_Defaults/2000000001/' " w:xpath="/ns0:NavWordReportXmlPart[1]/ns0:BCReportInformation[1]/ns0:CompanyMetadata[1]/ns0:CompanyEmail[1]" w:storeItemID="{20B1C7BE-CC2E-41B2-B1D5-B0B8F36428EB}"/>
               <w15:color w:val="808080"/>
               <w:text/>
             </w:sdtPr>
             <w:sdtContent>
               <w:r>
-                <w:t>John.doe@cronus.com</w:t>
+                <w:t>Company Email</w:t>
               </w:r>
             </w:sdtContent>
           </w:sdt>
@@ -278,13 +290,13 @@
               <w:placeholder>
                 <w:docPart w:val="D3505BE1584B4C0CB19F373171A839AB"/>
               </w:placeholder>
-              <w:dataBinding w:prefixMappings="xmlns:ns0='urn:microsoft-dynamics-nav/reports/Tenant_Report_Defaults/2000000001/'" w:xpath="/ns0:NavWordReportXmlPart[1]/ns0:BCReportInformation[1]/ns0:CompanyMetadata[1]/ns0:CompanyFaxNo[1]" w:storeItemID="{00000000-0000-0000-0000-000000000000}"/>
+              <w:dataBinding w:prefixMappings="xmlns:ns0='urn:microsoft-dynamics-nav/reports/Tenant_Report_Defaults/2000000001/' " w:xpath="/ns0:NavWordReportXmlPart[1]/ns0:BCReportInformation[1]/ns0:CompanyMetadata[1]/ns0:CompanyFaxNo[1]" w:storeItemID="{20B1C7BE-CC2E-41B2-B1D5-B0B8F36428EB}"/>
               <w15:color w:val="808080"/>
               <w:text/>
             </w:sdtPr>
             <w:sdtContent>
               <w:r>
-                <w:t>12345678</w:t>
+                <w:t>Company Fax No.</w:t>
               </w:r>
             </w:sdtContent>
           </w:sdt>
@@ -322,13 +334,16 @@
     <w:tr>
       <w:trPr>
         <w:cnfStyle w:val="100000000000" w:firstRow="1" w:lastRow="0" w:firstColumn="0" w:lastColumn="0" w:oddVBand="0" w:evenVBand="0" w:oddHBand="0" w:evenHBand="0" w:firstRowFirstColumn="0" w:firstRowLastColumn="0" w:lastRowFirstColumn="0" w:lastRowLastColumn="0"/>
-        <w:trHeight w:val="266"/>
+        <w:trHeight w:val="80"/>
       </w:trPr>
       <w:tc>
         <w:tcPr>
           <w:tcW w:w="2624" w:type="dxa"/>
         </w:tcPr>
         <w:p>
+          <w:pPr>
+            <w:spacing w:line="240" w:lineRule="auto"/>
+          </w:pPr>
           <w:sdt>
             <w:sdtPr>
               <w:alias w:val="CompanyHomePageCaption"/>
@@ -337,13 +352,13 @@
               <w:placeholder>
                 <w:docPart w:val="067CE0F5B1414AF090F2664D9F153C56"/>
               </w:placeholder>
-              <w:dataBinding w:prefixMappings="xmlns:ns0='urn:microsoft-dynamics-nav/reports/Tenant_Report_Defaults/2000000001/'" w:xpath="/ns0:NavWordReportXmlPart[1]/ns0:BCReportInformation[1]/ns0:CompanyMetadata[1]/ns0:CompanyHomePageCaption[1]" w:storeItemID="{00000000-0000-0000-0000-000000000000}"/>
+              <w:dataBinding w:prefixMappings="xmlns:ns0='urn:microsoft-dynamics-nav/reports/Tenant_Report_Defaults/2000000001/' " w:xpath="/ns0:NavWordReportXmlPart[1]/ns0:BCReportInformation[1]/ns0:CompanyMetadata[1]/ns0:CompanyHomePageCaption[1]" w:storeItemID="{20B1C7BE-CC2E-41B2-B1D5-B0B8F36428EB}"/>
               <w15:color w:val="808080"/>
               <w:text/>
             </w:sdtPr>
             <w:sdtContent>
               <w:r>
-                <w:t>Homepage</w:t>
+                <w:t>Company Home Page Caption</w:t>
               </w:r>
             </w:sdtContent>
           </w:sdt>
@@ -354,6 +369,9 @@
           <w:tcW w:w="2624" w:type="dxa"/>
         </w:tcPr>
         <w:p>
+          <w:pPr>
+            <w:spacing w:line="240" w:lineRule="auto"/>
+          </w:pPr>
           <w:sdt>
             <w:sdtPr>
               <w:alias w:val="CompanyPhoneCaption"/>
@@ -362,13 +380,13 @@
               <w:placeholder>
                 <w:docPart w:val="C0C6DCA2E42E4E4DBB88663B3ACFAE98"/>
               </w:placeholder>
-              <w:dataBinding w:prefixMappings="xmlns:ns0='urn:microsoft-dynamics-nav/reports/Tenant_Report_Defaults/2000000001/'" w:xpath="/ns0:NavWordReportXmlPart[1]/ns0:BCReportInformation[1]/ns0:CompanyMetadata[1]/ns0:CompanyPhoneCaption[1]" w:storeItemID="{00000000-0000-0000-0000-000000000000}"/>
+              <w:dataBinding w:prefixMappings="xmlns:ns0='urn:microsoft-dynamics-nav/reports/Tenant_Report_Defaults/2000000001/' " w:xpath="/ns0:NavWordReportXmlPart[1]/ns0:BCReportInformation[1]/ns0:CompanyMetadata[1]/ns0:CompanyPhoneCaption[1]" w:storeItemID="{20B1C7BE-CC2E-41B2-B1D5-B0B8F36428EB}"/>
               <w15:color w:val="808080"/>
               <w:text/>
             </w:sdtPr>
             <w:sdtContent>
               <w:r>
-                <w:t>Phone No</w:t>
+                <w:t>Company Phone Caption</w:t>
               </w:r>
             </w:sdtContent>
           </w:sdt>
@@ -379,6 +397,9 @@
           <w:tcW w:w="2623" w:type="dxa"/>
         </w:tcPr>
         <w:p>
+          <w:pPr>
+            <w:spacing w:line="240" w:lineRule="auto"/>
+          </w:pPr>
           <w:sdt>
             <w:sdtPr>
               <w:alias w:val="CompanyEmailCaption"/>
@@ -387,13 +408,13 @@
               <w:placeholder>
                 <w:docPart w:val="0C257D1428B04DE7A399D6D69BD76CF4"/>
               </w:placeholder>
-              <w:dataBinding w:prefixMappings="xmlns:ns0='urn:microsoft-dynamics-nav/reports/Tenant_Report_Defaults/2000000001/'" w:xpath="/ns0:NavWordReportXmlPart[1]/ns0:BCReportInformation[1]/ns0:CompanyMetadata[1]/ns0:CompanyEmailCaption[1]" w:storeItemID="{00000000-0000-0000-0000-000000000000}"/>
+              <w:dataBinding w:prefixMappings="xmlns:ns0='urn:microsoft-dynamics-nav/reports/Tenant_Report_Defaults/2000000001/' " w:xpath="/ns0:NavWordReportXmlPart[1]/ns0:BCReportInformation[1]/ns0:CompanyMetadata[1]/ns0:CompanyEmailCaption[1]" w:storeItemID="{20B1C7BE-CC2E-41B2-B1D5-B0B8F36428EB}"/>
               <w15:color w:val="808080"/>
               <w:text/>
             </w:sdtPr>
             <w:sdtContent>
               <w:r>
-                <w:t>Email</w:t>
+                <w:t>Company Email Caption</w:t>
               </w:r>
             </w:sdtContent>
           </w:sdt>
@@ -404,6 +425,9 @@
           <w:tcW w:w="2624" w:type="dxa"/>
         </w:tcPr>
         <w:p>
+          <w:pPr>
+            <w:spacing w:line="240" w:lineRule="auto"/>
+          </w:pPr>
           <w:sdt>
             <w:sdtPr>
               <w:alias w:val="CompanyFaxNoCaption"/>
@@ -412,13 +436,13 @@
               <w:placeholder>
                 <w:docPart w:val="6E72FD76A31945ADB33323FBA103AC87"/>
               </w:placeholder>
-              <w:dataBinding w:prefixMappings="xmlns:ns0='urn:microsoft-dynamics-nav/reports/Tenant_Report_Defaults/2000000001/'" w:xpath="/ns0:NavWordReportXmlPart[1]/ns0:BCReportInformation[1]/ns0:CompanyMetadata[1]/ns0:CompanyFaxNoCaption[1]" w:storeItemID="{00000000-0000-0000-0000-000000000000}"/>
+              <w:dataBinding w:prefixMappings="xmlns:ns0='urn:microsoft-dynamics-nav/reports/Tenant_Report_Defaults/2000000001/' " w:xpath="/ns0:NavWordReportXmlPart[1]/ns0:BCReportInformation[1]/ns0:CompanyMetadata[1]/ns0:CompanyFaxNoCaption[1]" w:storeItemID="{20B1C7BE-CC2E-41B2-B1D5-B0B8F36428EB}"/>
               <w15:color w:val="808080"/>
               <w:text/>
             </w:sdtPr>
             <w:sdtContent>
               <w:r>
-                <w:t>Fax No.</w:t>
+                <w:t>Company Fax No. Caption</w:t>
               </w:r>
             </w:sdtContent>
           </w:sdt>
@@ -442,13 +466,13 @@
               <w:placeholder>
                 <w:docPart w:val="7D742D481E5A44EAA108F72FB919A500"/>
               </w:placeholder>
-              <w:dataBinding w:prefixMappings="xmlns:ns0='urn:microsoft-dynamics-nav/reports/Tenant_Report_Defaults/2000000001/'" w:xpath="/ns0:NavWordReportXmlPart[1]/ns0:BCReportInformation[1]/ns0:CompanyMetadata[1]/ns0:CompanyHomePage[1]" w:storeItemID="{00000000-0000-0000-0000-000000000000}"/>
+              <w:dataBinding w:prefixMappings="xmlns:ns0='urn:microsoft-dynamics-nav/reports/Tenant_Report_Defaults/2000000001/' " w:xpath="/ns0:NavWordReportXmlPart[1]/ns0:BCReportInformation[1]/ns0:CompanyMetadata[1]/ns0:CompanyHomePage[1]" w:storeItemID="{20B1C7BE-CC2E-41B2-B1D5-B0B8F36428EB}"/>
               <w15:color w:val="808080"/>
               <w:text/>
             </w:sdtPr>
             <w:sdtContent>
               <w:r>
-                <w:t>www.cronus.dk</w:t>
+                <w:t>Company Home Page</w:t>
               </w:r>
             </w:sdtContent>
           </w:sdt>
@@ -467,13 +491,13 @@
               <w:placeholder>
                 <w:docPart w:val="8725BB94805441A1A5AA8655709E8AE7"/>
               </w:placeholder>
-              <w:dataBinding w:prefixMappings="xmlns:ns0='urn:microsoft-dynamics-nav/reports/Tenant_Report_Defaults/2000000001/'" w:xpath="/ns0:NavWordReportXmlPart[1]/ns0:BCReportInformation[1]/ns0:CompanyMetadata[1]/ns0:CompanyPhone[1]" w:storeItemID="{00000000-0000-0000-0000-000000000000}"/>
+              <w:dataBinding w:prefixMappings="xmlns:ns0='urn:microsoft-dynamics-nav/reports/Tenant_Report_Defaults/2000000001/' " w:xpath="/ns0:NavWordReportXmlPart[1]/ns0:BCReportInformation[1]/ns0:CompanyMetadata[1]/ns0:CompanyPhone[1]" w:storeItemID="{20B1C7BE-CC2E-41B2-B1D5-B0B8F36428EB}"/>
               <w15:color w:val="808080"/>
               <w:text/>
             </w:sdtPr>
             <w:sdtContent>
               <w:r>
-                <w:t>34-2345667</w:t>
+                <w:t>Company Phone</w:t>
               </w:r>
             </w:sdtContent>
           </w:sdt>
@@ -492,13 +516,13 @@
               <w:placeholder>
                 <w:docPart w:val="FF124920E4004690A9DA8E86EFCF7D19"/>
               </w:placeholder>
-              <w:dataBinding w:prefixMappings="xmlns:ns0='urn:microsoft-dynamics-nav/reports/Tenant_Report_Defaults/2000000001/'" w:xpath="/ns0:NavWordReportXmlPart[1]/ns0:BCReportInformation[1]/ns0:CompanyMetadata[1]/ns0:CompanyEmail[1]" w:storeItemID="{00000000-0000-0000-0000-000000000000}"/>
+              <w:dataBinding w:prefixMappings="xmlns:ns0='urn:microsoft-dynamics-nav/reports/Tenant_Report_Defaults/2000000001/' " w:xpath="/ns0:NavWordReportXmlPart[1]/ns0:BCReportInformation[1]/ns0:CompanyMetadata[1]/ns0:CompanyEmail[1]" w:storeItemID="{20B1C7BE-CC2E-41B2-B1D5-B0B8F36428EB}"/>
               <w15:color w:val="808080"/>
               <w:text/>
             </w:sdtPr>
             <w:sdtContent>
               <w:r>
-                <w:t>John.doe@cronus.com</w:t>
+                <w:t>Company Email</w:t>
               </w:r>
             </w:sdtContent>
           </w:sdt>
@@ -517,13 +541,13 @@
               <w:placeholder>
                 <w:docPart w:val="2C79A60C2C1342C9AAFEE8B641A99C16"/>
               </w:placeholder>
-              <w:dataBinding w:prefixMappings="xmlns:ns0='urn:microsoft-dynamics-nav/reports/Tenant_Report_Defaults/2000000001/'" w:xpath="/ns0:NavWordReportXmlPart[1]/ns0:BCReportInformation[1]/ns0:CompanyMetadata[1]/ns0:CompanyFaxNo[1]" w:storeItemID="{00000000-0000-0000-0000-000000000000}"/>
+              <w:dataBinding w:prefixMappings="xmlns:ns0='urn:microsoft-dynamics-nav/reports/Tenant_Report_Defaults/2000000001/' " w:xpath="/ns0:NavWordReportXmlPart[1]/ns0:BCReportInformation[1]/ns0:CompanyMetadata[1]/ns0:CompanyFaxNo[1]" w:storeItemID="{20B1C7BE-CC2E-41B2-B1D5-B0B8F36428EB}"/>
               <w15:color w:val="808080"/>
               <w:text/>
             </w:sdtPr>
             <w:sdtContent>
               <w:r>
-                <w:t>12345678</w:t>
+                <w:t>Company Fax No.</w:t>
               </w:r>
             </w:sdtContent>
           </w:sdt>
@@ -603,7 +627,7 @@
             <w:placeholder>
               <w:docPart w:val="864FDC8F657849A2A8781EFFDD74C3AE"/>
             </w:placeholder>
-            <w:dataBinding w:prefixMappings="xmlns:ns0='urn:microsoft-dynamics-nav/reports/Tenant_Report_Defaults/2000000001/'" w:xpath="/ns0:NavWordReportXmlPart[1]/ns0:BCReportInformation[1]/ns0:ReportMetadata[1]/ns0:ReportCaption[1]" w:storeItemID="{00000000-0000-0000-0000-000000000000}"/>
+            <w:dataBinding w:prefixMappings="xmlns:ns0='urn:microsoft-dynamics-nav/reports/Tenant_Report_Defaults/2000000001/' " w:xpath="/ns0:NavWordReportXmlPart[1]/ns0:BCReportInformation[1]/ns0:ReportMetadata[1]/ns0:ReportCaption[1]" w:storeItemID="{20B1C7BE-CC2E-41B2-B1D5-B0B8F36428EB}"/>
             <w15:color w:val="808080"/>
             <w:text/>
           </w:sdtPr>
@@ -773,7 +797,7 @@
               <w:placeholder>
                 <w:docPart w:val="D8E27797D68E4E64805B125585875C0B"/>
               </w:placeholder>
-              <w:dataBinding w:prefixMappings="xmlns:ns0='urn:microsoft-dynamics-nav/reports/Tenant_Report_Defaults/2000000001/'" w:xpath="/ns0:NavWordReportXmlPart[1]/ns0:BCReportInformation[1]/ns0:ReportRequest[1]/ns0:CompanyName[1]" w:storeItemID="{00000000-0000-0000-0000-000000000000}"/>
+              <w:dataBinding w:prefixMappings="xmlns:ns0='urn:microsoft-dynamics-nav/reports/Tenant_Report_Defaults/2000000001/' " w:xpath="/ns0:NavWordReportXmlPart[1]/ns0:BCReportInformation[1]/ns0:ReportRequest[1]/ns0:CompanyName[1]" w:storeItemID="{20B1C7BE-CC2E-41B2-B1D5-B0B8F36428EB}"/>
               <w15:color w:val="808080"/>
               <w:text/>
             </w:sdtPr>
@@ -835,7 +859,7 @@
 </file>
 
 <file path=word/header3.xml><?xml version="1.0" encoding="utf-8"?>
-<w:hdr xmlns:a="http://schemas.openxmlformats.org/drawingml/2006/main" xmlns:pic="http://schemas.openxmlformats.org/drawingml/2006/picture" xmlns:a14="http://schemas.microsoft.com/office/drawing/2010/main" xmlns:wpc="http://schemas.microsoft.com/office/word/2010/wordprocessingCanvas" xmlns:cx="http://schemas.microsoft.com/office/drawing/2014/chartex" xmlns:cx1="http://schemas.microsoft.com/office/drawing/2015/9/8/chartex" xmlns:cx2="http://schemas.microsoft.com/office/drawing/2015/10/21/chartex" xmlns:cx3="http://schemas.microsoft.com/office/drawing/2016/5/9/chartex" xmlns:cx4="http://schemas.microsoft.com/office/drawing/2016/5/10/chartex" xmlns:cx5="http://schemas.microsoft.com/office/drawing/2016/5/11/chartex" xmlns:cx6="http://schemas.microsoft.com/office/drawing/2016/5/12/chartex" xmlns:cx7="http://schemas.microsoft.com/office/drawing/2016/5/13/chartex" xmlns:cx8="http://schemas.microsoft.com/office/drawing/2016/5/14/chartex" xmlns:mc="http://schemas.openxmlformats.org/markup-compatibility/2006" xmlns:aink="http://schemas.microsoft.com/office/drawing/2016/ink" xmlns:am3d="http://schemas.microsoft.com/office/drawing/2017/model3d" xmlns:o="urn:schemas-microsoft-com:office:office" xmlns:oel="http://schemas.microsoft.com/office/2019/extlst" xmlns:r="http://schemas.openxmlformats.org/officeDocument/2006/relationships" xmlns:m="http://schemas.openxmlformats.org/officeDocument/2006/math" xmlns:v="urn:schemas-microsoft-com:vml" xmlns:wp14="http://schemas.microsoft.com/office/word/2010/wordprocessingDrawing" xmlns:wp="http://schemas.openxmlformats.org/drawingml/2006/wordprocessingDrawing" xmlns:w10="urn:schemas-microsoft-com:office:word" xmlns:w="http://schemas.openxmlformats.org/wordprocessingml/2006/main" xmlns:w14="http://schemas.microsoft.com/office/word/2010/wordml" xmlns:w15="http://schemas.microsoft.com/office/word/2012/wordml" xmlns:w16cex="http://schemas.microsoft.com/office/word/2018/wordml/cex" xmlns:w16cid="http://schemas.microsoft.com/office/word/2016/wordml/cid" xmlns:w16="http://schemas.microsoft.com/office/word/2018/wordml" xmlns:w16du="http://schemas.microsoft.com/office/word/2023/wordml/word16du" xmlns:w16sdtdh="http://schemas.microsoft.com/office/word/2020/wordml/sdtdatahash" xmlns:w16sdtfl="http://schemas.microsoft.com/office/word/2024/wordml/sdtformatlock" xmlns:w16se="http://schemas.microsoft.com/office/word/2015/wordml/symex" xmlns:wpg="http://schemas.microsoft.com/office/word/2010/wordprocessingGroup" xmlns:wpi="http://schemas.microsoft.com/office/word/2010/wordprocessingInk" xmlns:wne="http://schemas.microsoft.com/office/word/2006/wordml" xmlns:wps="http://schemas.microsoft.com/office/word/2010/wordprocessingShape" mc:Ignorable="w14 w15 w16se w16cid w16 w16cex w16sdtdh w16sdtfl w16du wp14">
+<w:hdr xmlns:wpc="http://schemas.microsoft.com/office/word/2010/wordprocessingCanvas" xmlns:cx="http://schemas.microsoft.com/office/drawing/2014/chartex" xmlns:cx1="http://schemas.microsoft.com/office/drawing/2015/9/8/chartex" xmlns:cx2="http://schemas.microsoft.com/office/drawing/2015/10/21/chartex" xmlns:cx3="http://schemas.microsoft.com/office/drawing/2016/5/9/chartex" xmlns:cx4="http://schemas.microsoft.com/office/drawing/2016/5/10/chartex" xmlns:cx5="http://schemas.microsoft.com/office/drawing/2016/5/11/chartex" xmlns:cx6="http://schemas.microsoft.com/office/drawing/2016/5/12/chartex" xmlns:cx7="http://schemas.microsoft.com/office/drawing/2016/5/13/chartex" xmlns:cx8="http://schemas.microsoft.com/office/drawing/2016/5/14/chartex" xmlns:mc="http://schemas.openxmlformats.org/markup-compatibility/2006" xmlns:aink="http://schemas.microsoft.com/office/drawing/2016/ink" xmlns:am3d="http://schemas.microsoft.com/office/drawing/2017/model3d" xmlns:o="urn:schemas-microsoft-com:office:office" xmlns:oel="http://schemas.microsoft.com/office/2019/extlst" xmlns:r="http://schemas.openxmlformats.org/officeDocument/2006/relationships" xmlns:m="http://schemas.openxmlformats.org/officeDocument/2006/math" xmlns:v="urn:schemas-microsoft-com:vml" xmlns:wp14="http://schemas.microsoft.com/office/word/2010/wordprocessingDrawing" xmlns:wp="http://schemas.openxmlformats.org/drawingml/2006/wordprocessingDrawing" xmlns:w10="urn:schemas-microsoft-com:office:word" xmlns:w="http://schemas.openxmlformats.org/wordprocessingml/2006/main" xmlns:w14="http://schemas.microsoft.com/office/word/2010/wordml" xmlns:w15="http://schemas.microsoft.com/office/word/2012/wordml" xmlns:w16cex="http://schemas.microsoft.com/office/word/2018/wordml/cex" xmlns:w16cid="http://schemas.microsoft.com/office/word/2016/wordml/cid" xmlns:w16="http://schemas.microsoft.com/office/word/2018/wordml" xmlns:w16du="http://schemas.microsoft.com/office/word/2023/wordml/word16du" xmlns:w16sdtdh="http://schemas.microsoft.com/office/word/2020/wordml/sdtdatahash" xmlns:w16sdtfl="http://schemas.microsoft.com/office/word/2024/wordml/sdtformatlock" xmlns:w16se="http://schemas.microsoft.com/office/word/2015/wordml/symex" xmlns:wpg="http://schemas.microsoft.com/office/word/2010/wordprocessingGroup" xmlns:wpi="http://schemas.microsoft.com/office/word/2010/wordprocessingInk" xmlns:wne="http://schemas.microsoft.com/office/word/2006/wordml" xmlns:wps="http://schemas.microsoft.com/office/word/2010/wordprocessingShape" mc:Ignorable="w14 w15 w16se w16cid w16 w16cex w16sdtdh w16sdtfl w16du wp14">
   <w:tbl>
     <w:tblPr>
       <w:tblStyle w:val="BCBlockTable"/>
@@ -863,7 +887,7 @@
           <w:placeholder>
             <w:docPart w:val="45BE75433E5A4D029A142C74AA65F54A"/>
           </w:placeholder>
-          <w:dataBinding w:prefixMappings="xmlns:ns0='urn:microsoft-dynamics-nav/reports/Tenant_Report_Defaults/2000000001/'" w:xpath="/ns0:NavWordReportXmlPart[1]/ns0:BCReportInformation[1]/ns0:ReportMetadata[1]/ns0:ReportCaption[1]" w:storeItemID="{00000000-0000-0000-0000-000000000000}"/>
+          <w:dataBinding w:prefixMappings="xmlns:ns0='urn:microsoft-dynamics-nav/reports/Tenant_Report_Defaults/2000000001/' " w:xpath="/ns0:NavWordReportXmlPart[1]/ns0:BCReportInformation[1]/ns0:ReportMetadata[1]/ns0:ReportCaption[1]" w:storeItemID="{20B1C7BE-CC2E-41B2-B1D5-B0B8F36428EB}"/>
           <w15:color w:val="808080"/>
           <w:text/>
         </w:sdtPr>
@@ -986,7 +1010,7 @@
               <w:alias w:val="CompanyLogo"/>
               <w:tag w:val="#BC:InsertDataItem,BCReportInformation/CompanyMetadata/CompanyLogo"/>
               <w:id w:val="943343575"/>
-              <w:dataBinding w:prefixMappings="xmlns:ns0='urn:microsoft-dynamics-nav/reports/Tenant_Report_Defaults/2000000001/'" w:xpath="/ns0:NavWordReportXmlPart[1]/ns0:BCReportInformation[1]/ns0:CompanyMetadata[1]/ns0:CompanyLogo[1]" w:storeItemID="{00000000-0000-0000-0000-000000000000}"/>
+              <w:dataBinding w:prefixMappings="xmlns:ns0='urn:microsoft-dynamics-nav/reports/Tenant_Report_Defaults/2000000001/' " w:xpath="/ns0:NavWordReportXmlPart[1]/ns0:BCReportInformation[1]/ns0:CompanyMetadata[1]/ns0:CompanyLogo[1]" w:storeItemID="{20B1C7BE-CC2E-41B2-B1D5-B0B8F36428EB}"/>
               <w:picture/>
             </w:sdtPr>
             <w:sdtContent>
@@ -997,8 +1021,8 @@
                 <w:drawing>
                   <wp:inline distT="0" distB="0" distL="0" distR="0" wp14:anchorId="229DEBE4" wp14:editId="1F6F61CC">
                     <wp:extent cx="1080000" cy="1080000"/>
-                    <wp:effectExtent l="0" t="0" r="5715" b="3175"/>
-                    <wp:docPr id="901932688" name="Billede 1" descr="The image is a plain white background with no additional elements or details.&#10;&#10;AI-generated content may be incorrect."/>
+                    <wp:effectExtent l="0" t="0" r="6350" b="6350"/>
+                    <wp:docPr id="901932688" name="Billede 1"/>
                     <wp:cNvGraphicFramePr>
                       <a:graphicFrameLocks xmlns:a="http://schemas.openxmlformats.org/drawingml/2006/main" noChangeAspect="1"/>
                     </wp:cNvGraphicFramePr>
@@ -1006,20 +1030,13 @@
                       <a:graphicData uri="http://schemas.openxmlformats.org/drawingml/2006/picture">
                         <pic:pic xmlns:pic="http://schemas.openxmlformats.org/drawingml/2006/picture">
                           <pic:nvPicPr>
-                            <pic:cNvPr id="2" name="Billede 1" descr="The image is a plain white background with no additional elements or details.&#10;&#10;AI-generated content may be incorrect."/>
+                            <pic:cNvPr id="901932688" name="Billede 1"/>
                             <pic:cNvPicPr>
                               <a:picLocks noChangeAspect="1" noChangeArrowheads="1"/>
                             </pic:cNvPicPr>
                           </pic:nvPicPr>
                           <pic:blipFill>
-                            <a:blip r:embed="rId1">
-                              <a:extLst>
-                                <a:ext uri="{28A0092B-C50C-407E-A947-70E740481C1C}">
-                                  <a14:useLocalDpi xmlns:a14="http://schemas.microsoft.com/office/drawing/2010/main" val="0"/>
-                                </a:ext>
-                              </a:extLst>
-                            </a:blip>
-                            <a:srcRect/>
+                            <a:blip r:embed="rId1"/>
                             <a:stretch>
                               <a:fillRect/>
                             </a:stretch>
@@ -2466,7 +2483,6 @@
     <w:uiPriority w:val="1"/>
     <w:semiHidden/>
     <w:unhideWhenUsed/>
-    <w:rsid w:val="00463DE3"/>
   </w:style>
   <w:style w:type="table" w:default="1" w:styleId="TableNormal">
     <w:name w:val="Normal Table"/>
@@ -2488,7 +2504,6 @@
     <w:uiPriority w:val="99"/>
     <w:semiHidden/>
     <w:unhideWhenUsed/>
-    <w:rsid w:val="00463DE3"/>
   </w:style>
   <w:style w:type="table" w:styleId="TableGrid">
     <w:name w:val="Table Grid"/>
@@ -29800,12 +29815,14 @@
     <w:sig w:usb0="E00006FF" w:usb1="0000FCFF" w:usb2="00000001" w:usb3="00000000" w:csb0="0000019F" w:csb1="00000000"/>
   </w:font>
   <w:font w:name="Aptos">
+    <w:panose1 w:val="020B0004020202020204"/>
     <w:charset w:val="00"/>
     <w:family w:val="swiss"/>
     <w:pitch w:val="variable"/>
     <w:sig w:usb0="20000287" w:usb1="00000003" w:usb2="00000000" w:usb3="00000000" w:csb0="0000019F" w:csb1="00000000"/>
   </w:font>
   <w:font w:name="Aptos Display">
+    <w:panose1 w:val="020B0004020202020204"/>
     <w:charset w:val="00"/>
     <w:family w:val="swiss"/>
     <w:pitch w:val="variable"/>
@@ -29834,6 +29851,7 @@
     <w:rsid w:val="00003B56"/>
     <w:rsid w:val="0003303F"/>
     <w:rsid w:val="00042276"/>
+    <w:rsid w:val="000617F1"/>
     <w:rsid w:val="000706A7"/>
     <w:rsid w:val="00073078"/>
     <w:rsid w:val="00082B18"/>
@@ -29938,6 +29956,7 @@
     <w:rsid w:val="00D52343"/>
     <w:rsid w:val="00D95C9F"/>
     <w:rsid w:val="00E428EF"/>
+    <w:rsid w:val="00E4478A"/>
     <w:rsid w:val="00E46016"/>
     <w:rsid w:val="00E61CC3"/>
     <w:rsid w:val="00E70BBF"/>
@@ -30423,19 +30442,6 @@
       <w14:ligatures w14:val="standardContextual"/>
     </w:rPr>
   </w:style>
-  <w:style w:type="paragraph" w:customStyle="1" w:styleId="B73C6E87F5024B9C9673F093430A757F">
-    <w:name w:val="B73C6E87F5024B9C9673F093430A757F"/>
-    <w:rsid w:val="00514E7E"/>
-    <w:pPr>
-      <w:spacing w:line="278" w:lineRule="auto"/>
-    </w:pPr>
-    <w:rPr>
-      <w:kern w:val="2"/>
-      <w:sz w:val="24"/>
-      <w:szCs w:val="24"/>
-      <w14:ligatures w14:val="standardContextual"/>
-    </w:rPr>
-  </w:style>
   <w:style w:type="paragraph" w:customStyle="1" w:styleId="CF68DC289354454998E7B9E61A5A8DE8">
     <w:name w:val="CF68DC289354454998E7B9E61A5A8DE8"/>
     <w:pPr>
@@ -30944,7 +30950,16 @@
 </we:webextension>
 </file>
 
-<file path=customXml/item1.xml>��< ? x m l   v e r s i o n = " 1 . 0 "   e n c o d i n g = " u t f - 1 6 " ? > < N a v W o r d R e p o r t X m l P a r t   x m l n s = " u r n : m i c r o s o f t - d y n a m i c s - n a v / r e p o r t s / T e n a n t _ R e p o r t _ D e f a u l t s / 2 0 0 0 0 0 0 0 0 1 / " > +<file path=customXml/item1.xml><?xml version="1.0" encoding="utf-8"?>
+<?mso-contentType ?>
+<FormTemplates xmlns="http://schemas.microsoft.com/sharepoint/v3/contenttype/forms">
+  <Display>DocumentLibraryForm</Display>
+  <Edit>DocumentLibraryForm</Edit>
+  <New>DocumentLibraryForm</New>
+</FormTemplates>
+</file>
+
+<file path=customXml/item2.xml>��< ? x m l   v e r s i o n = " 1 . 0 "   e n c o d i n g = " u t f - 1 6 " ? > < N a v W o r d R e p o r t X m l P a r t   x m l n s = " u r n : m i c r o s o f t - d y n a m i c s - n a v / r e p o r t s / T e n a n t _ R e p o r t _ D e f a u l t s / 2 0 0 0 0 0 0 0 0 1 / " >   
      < B C R e p o r t I n f o r m a t i o n >   
@@ -31093,32 +31108,162 @@
  < / N a v W o r d R e p o r t X m l P a r t > 
 </file>
 
-<file path=customXml/item2.xml><?xml version="1.0" encoding="utf-8"?>
-<?mso-contentType ?>
-<FormTemplates xmlns="http://schemas.microsoft.com/sharepoint/v3/contenttype/forms">
-  <Display>DocumentLibraryForm</Display>
-  <Edit>DocumentLibraryForm</Edit>
-  <New>DocumentLibraryForm</New>
-</FormTemplates>
+<file path=customXml/item3.xml><?xml version="1.0" encoding="utf-8"?>
+<b:Sources xmlns:b="http://schemas.openxmlformats.org/officeDocument/2006/bibliography" xmlns="http://schemas.openxmlformats.org/officeDocument/2006/bibliography" SelectedStyle="\APASixthEditionOfficeOnline.xsl" StyleName="APA" Version="6"/>
 </file>
 
-<file path=customXml/item3.xml><?xml version="1.0" encoding="utf-8"?>
-<p:properties xmlns:p="http://schemas.microsoft.com/office/2006/metadata/properties" xmlns:xsi="http://www.w3.org/2001/XMLSchema-instance" xmlns:pc="http://schemas.microsoft.com/office/infopath/2007/PartnerControls">
-  <documentManagement>
-    <Package xmlns="178f68d8-b893-4efd-8406-fab0f21873e4" xsi:nil="true"/>
-    <lcf76f155ced4ddcb4097134ff3c332f xmlns="178f68d8-b893-4efd-8406-fab0f21873e4">
-      <Terms xmlns="http://schemas.microsoft.com/office/infopath/2007/PartnerControls"/>
-    </lcf76f155ced4ddcb4097134ff3c332f>
-    <_ip_UnifiedCompliancePolicyUIAction xmlns="http://schemas.microsoft.com/sharepoint/v3" xsi:nil="true"/>
-    <TaxCatchAll xmlns="b83e059f-de16-406c-a902-3d56d4e79ec8" xsi:nil="true"/>
-    <Audience xmlns="178f68d8-b893-4efd-8406-fab0f21873e4" xsi:nil="true"/>
-    <_ip_UnifiedCompliancePolicyProperties xmlns="http://schemas.microsoft.com/sharepoint/v3" xsi:nil="true"/>
-    <DocumentType xmlns="178f68d8-b893-4efd-8406-fab0f21873e4" xsi:nil="true"/>
-  </documentManagement>
-</p:properties>
+<file path=customXml/item4.xml>��< ? x m l   v e r s i o n = " 1 . 0 "   e n c o d i n g = " u t f - 1 6 " ? > < N a v W o r d R e p o r t X m l P a r t   x m l n s = " u r n : m i c r o s o f t - d y n a m i c s - b u s i n e s s c e n t r a l / i n t e r n a l / e x t e n d e d / r e p o r t s / T e n a n t _ R e p o r t _ D e f a u l t s / 2 0 0 0 0 0 0 0 0 1 / " > + 
+     < B C R e p o r t I n f o r m a t i o n > + 
+         < R e p o r t M e t a d a t a > + 
+             < E x t e n s i o n I d > E x t e n s i o n   I D < / E x t e n s i o n I d > + 
+             < E x t e n s i o n N a m e > E x t e n s i o n   N a m e < / E x t e n s i o n N a m e > + 
+             < E x t e n s i o n P u b l i s h e r > E x t e n s i o n   P u b l i s h e r < / E x t e n s i o n P u b l i s h e r > + 
+             < E x t e n s i o n V e r s i o n > E x t e n s i o n   V e r s i o n < / E x t e n s i o n V e r s i o n > + 
+             < R e p o r t I d > R e p o r t   I D < / R e p o r t I d > + 
+             < R e p o r t N a m e > R e p o r t   N a m e < / R e p o r t N a m e > + 
+             < R e p o r t C a p t i o n > R e p o r t   C a p t i o n < / R e p o r t C a p t i o n > + 
+             < A b o u t T h i s R e p o r t T i t l e > A b o u t   T h i s   R e p o r t   T i t l e < / A b o u t T h i s R e p o r t T i t l e > + 
+             < A b o u t T h i s R e p o r t T e x t > A b o u t   T h i s   R e p o r t   T e x t < / A b o u t T h i s R e p o r t T e x t > + 
+             < R e p o r t H e l p L i n k > R e p o r t   H e l p   L i n k < / R e p o r t H e l p L i n k > + 
+         < / R e p o r t M e t a d a t a > + 
+         < R e p o r t R e q u e s t > + 
+             < T e n a n t E n t r a I d > T e n a n t   E n t r a   I d < / T e n a n t E n t r a I d > + 
+             < E n v i r o n m e n t N a m e > E n v i r o n m e n t   N a m e < / E n v i r o n m e n t N a m e > + 
+             < E n v i r o n m e n t T y p e > E n v i r o n m e n t   T y p e < / E n v i r o n m e n t T y p e > + 
+             < C o m p a n y N a m e > C o m p a n y   N a m e < / C o m p a n y N a m e > + 
+             < C o m p a n y D i s p l a y N a m e > C o m p a n y   D i s p l a y   N a m e < / C o m p a n y D i s p l a y N a m e > + 
+             < C o m p a n y I d > C o m p a n y   I D < / C o m p a n y I d > + 
+             < U s e r N a m e > U s e r   N a m e < / U s e r N a m e > + 
+             < D a t e A n d T i m e > D a t e   a n d   T i m e < / D a t e A n d T i m e > + 
+             < L a n g u a g e > L a n g u a g e < / L a n g u a g e > + 
+             < F o r m a t R e g i o n > F o r m a t   R e g i o n < / F o r m a t R e g i o n > + 
+             < D a t e T i m e V a l u e s > + 
+                 < Y e a r > Y e a r < / Y e a r > + 
+                 < M o n t h N u m b e r > M o n t h   N u m b e r < / M o n t h N u m b e r > + 
+                 < D a y N u m b e r > D a y   N u m b e r < / D a y N u m b e r > + 
+                 < H o u r > H o u r < / H o u r > + 
+                 < M i n u t e > M i n u t e < / M i n u t e > + 
+             < / D a t e T i m e V a l u e s > + 
+         < / R e p o r t R e q u e s t > + 
+         < C o m p a n y M e t a d a t a > + 
+             < C o m p a n y N a m e > C o m p a n y   N a m e < / C o m p a n y N a m e > + 
+             < C o m p a n y D i s p l a y N a m e > C o m p a n y   D i s p l a y   N a m e < / C o m p a n y D i s p l a y N a m e > + 
+             < C o m p a n y A d d r e s s L i n e s > + 
+                 < C o m p a n y A d d r e s s L i n e 1 > C o m p a n y   A d d r e s s   L i n e   1 < / C o m p a n y A d d r e s s L i n e 1 > + 
+                 < C o m p a n y A d d r e s s L i n e 2 > C o m p a n y   A d d r e s s   L i n e   2 < / C o m p a n y A d d r e s s L i n e 2 > + 
+                 < C o m p a n y A d d r e s s L i n e 3 > C o m p a n y   A d d r e s s   L i n e   3 < / C o m p a n y A d d r e s s L i n e 3 > + 
+                 < C o m p a n y A d d r e s s L i n e 4 > C o m p a n y   A d d r e s s   L i n e   4 < / C o m p a n y A d d r e s s L i n e 4 > + 
+                 < C o m p a n y A d d r e s s L i n e 5 > C o m p a n y   A d d r e s s   L i n e   5 < / C o m p a n y A d d r e s s L i n e 5 > + 
+                 < C o m p a n y A d d r e s s L i n e 6 > C o m p a n y   A d d r e s s   L i n e   6 < / C o m p a n y A d d r e s s L i n e 6 > + 
+                 < C o m p a n y A d d r e s s L i n e 7 > C o m p a n y   A d d r e s s   L i n e   7 < / C o m p a n y A d d r e s s L i n e 7 > + 
+                 < C o m p a n y A d d r e s s L i n e 8 > C o m p a n y   A d d r e s s   L i n e   8 < / C o m p a n y A d d r e s s L i n e 8 > + 
+             < / C o m p a n y A d d r e s s L i n e s > + 
+             < C o m p a n y P h o n e > C o m p a n y   P h o n e < / C o m p a n y P h o n e > + 
+             < C o m p a n y P h o n e C a p t i o n > C o m p a n y   P h o n e   C a p t i o n < / C o m p a n y P h o n e C a p t i o n > + 
+             < C o m p a n y F a x N o > C o m p a n y   F a x   N o . < / C o m p a n y F a x N o > + 
+             < C o m p a n y F a x N o C a p t i o n > C o m p a n y   F a x   N o .   C a p t i o n < / C o m p a n y F a x N o C a p t i o n > + 
+             < C o m p a n y E m a i l > C o m p a n y   E m a i l < / C o m p a n y E m a i l > + 
+             < C o m p a n y E m a i l C a p t i o n > C o m p a n y   E m a i l   C a p t i o n < / C o m p a n y E m a i l C a p t i o n > + 
+             < C o m p a n y H o m e P a g e > C o m p a n y   H o m e   P a g e < / C o m p a n y H o m e P a g e > + 
+             < C o m p a n y H o m e P a g e C a p t i o n > C o m p a n y   H o m e   P a g e   C a p t i o n < / C o m p a n y H o m e P a g e C a p t i o n > + 
+             < C o m p a n y L o g o > C o m p a n y   L o g o < / C o m p a n y L o g o > + 
+             < C o m p a n y V A T R e g i s t r a t i o n N o > C o m p a n y   V A T   R e g i s t r a t i o n   N o . < / C o m p a n y V A T R e g i s t r a t i o n N o > + 
+             < C o m p a n y V A T R e g i s t r a t i o n N o C a p t i o n > C o m p a n y   V A T   R e g i s t r a t i o n   N o .   C a p t i o n < / C o m p a n y V A T R e g i s t r a t i o n N o C a p t i o n > + 
+             < C o m p a n y R e g i s t r a t i o n N o > C o m p a n y   R e g i s t r a t i o n   N o . < / C o m p a n y R e g i s t r a t i o n N o > + 
+             < C o m p a n y R e g i s t r a t i o n N o C a p t i o n > C o m p a n y   R e g i s t r a t i o n   N o .   C a p t i o n < / C o m p a n y R e g i s t r a t i o n N o C a p t i o n > + 
+             < C o m p a n y B a n k N a m e > C o m p a n y   B a n k   N a m e < / C o m p a n y B a n k N a m e > + 
+             < C o m p a n y B a n k N a m e C a p t i o n > C o m p a n y   B a n k   N a m e   C a p t i o n < / C o m p a n y B a n k N a m e C a p t i o n > + 
+             < C o m p a n y B a n k A c c o u n t N o > C o m p a n y   B a n k   A c c o u n t   N o . < / C o m p a n y B a n k A c c o u n t N o > + 
+             < C o m p a n y B a n k A c c o u n t N o C a p t i o n > C o m p a n y   B a n k   A c c o u n t   N o .   C a p t i o n < / C o m p a n y B a n k A c c o u n t N o C a p t i o n > + 
+             < C o m p a n y B a n k B r a n c h N o > C o m p a n y   B a n k   B r a n c h   N o . < / C o m p a n y B a n k B r a n c h N o > + 
+             < C o m p a n y B a n k B r a n c h N o C a p t i o n > C o m p a n y   B a n k   B r a n c h   N o .   C a p t i o n < / C o m p a n y B a n k B r a n c h N o C a p t i o n > + 
+             < C o m p a n y I B A N > C o m p a n y   I B A N < / C o m p a n y I B A N > + 
+             < C o m p a n y I B A N C a p t i o n > C o m p a n y   I B A N   C a p t i o n < / C o m p a n y I B A N C a p t i o n > + 
+             < C o m p a n y B a n k S W I F T > C o m p a n y   B a n k   S W I F T < / C o m p a n y B a n k S W I F T > + 
+             < C o m p a n y B a n k S W I F T C a p t i o n > C o m p a n y   B a n k   S W I F T   C a p t i o n < / C o m p a n y B a n k S W I F T C a p t i o n > + 
+             < C o m p a n y G i r o N o > C o m p a n y   G i r o   N o . < / C o m p a n y G i r o N o > + 
+             < C o m p a n y G i r o N o C a p t i o n > C o m p a n y   G i r o   N o .   C a p t i o n < / C o m p a n y G i r o N o C a p t i o n > + 
+         < / C o m p a n y M e t a d a t a > + 
+     < / B C R e p o r t I n f o r m a t i o n > + 
+     < T o o l t i p s / > + 
+ < / N a v W o r d R e p o r t X m l P a r t > 
 </file>
 
-<file path=customXml/item4.xml><?xml version="1.0" encoding="utf-8"?>
+<file path=customXml/item5.xml><?xml version="1.0" encoding="utf-8"?>
 <ct:contentTypeSchema xmlns:ct="http://schemas.microsoft.com/office/2006/metadata/contentType" xmlns:ma="http://schemas.microsoft.com/office/2006/metadata/properties/metaAttributes" ct:_="" ma:_="" ma:contentTypeName="Document" ma:contentTypeID="0x0101001DCAE6B6EBFA5442B0B9E84E60AFF245" ma:contentTypeVersion="18" ma:contentTypeDescription="Create a new document." ma:contentTypeScope="" ma:versionID="69eec3b24558e1297a79cd42e69b0397">
   <xsd:schema xmlns:xsd="http://www.w3.org/2001/XMLSchema" xmlns:xs="http://www.w3.org/2001/XMLSchema" xmlns:p="http://schemas.microsoft.com/office/2006/metadata/properties" xmlns:ns1="http://schemas.microsoft.com/sharepoint/v3" xmlns:ns2="178f68d8-b893-4efd-8406-fab0f21873e4" xmlns:ns3="b83e059f-de16-406c-a902-3d56d4e79ec8" targetNamespace="http://schemas.microsoft.com/office/2006/metadata/properties" ma:root="true" ma:fieldsID="0f52a3acd42ec0bd0d267ba89c916a39" ns1:_="" ns2:_="" ns3:_="">
     <xsd:import namespace="http://schemas.microsoft.com/sharepoint/v3"/>
@@ -31384,162 +31529,31 @@
 </ct:contentTypeSchema>
 </file>
 
-<file path=customXml/item5.xml>��< ? x m l   v e r s i o n = " 1 . 0 "   e n c o d i n g = " u t f - 1 6 " ? > < N a v W o r d R e p o r t X m l P a r t   x m l n s = " u r n : m i c r o s o f t - d y n a m i c s - b u s i n e s s c e n t r a l / i n t e r n a l / e x t e n d e d / r e p o r t s / T e n a n t _ R e p o r t _ D e f a u l t s / 2 0 0 0 0 0 0 0 0 1 / " > - 
-     < B C R e p o r t I n f o r m a t i o n > - 
-         < R e p o r t M e t a d a t a > - 
-             < E x t e n s i o n I d > E x t e n s i o n   I D < / E x t e n s i o n I d > - 
-             < E x t e n s i o n N a m e > E x t e n s i o n   N a m e < / E x t e n s i o n N a m e > - 
-             < E x t e n s i o n P u b l i s h e r > E x t e n s i o n   P u b l i s h e r < / E x t e n s i o n P u b l i s h e r > - 
-             < E x t e n s i o n V e r s i o n > E x t e n s i o n   V e r s i o n < / E x t e n s i o n V e r s i o n > - 
-             < R e p o r t I d > R e p o r t   I D < / R e p o r t I d > - 
-             < R e p o r t N a m e > R e p o r t   N a m e < / R e p o r t N a m e > - 
-             < R e p o r t C a p t i o n > R e p o r t   C a p t i o n < / R e p o r t C a p t i o n > - 
-             < A b o u t T h i s R e p o r t T i t l e > A b o u t   T h i s   R e p o r t   T i t l e < / A b o u t T h i s R e p o r t T i t l e > - 
-             < A b o u t T h i s R e p o r t T e x t > A b o u t   T h i s   R e p o r t   T e x t < / A b o u t T h i s R e p o r t T e x t > - 
-             < R e p o r t H e l p L i n k > R e p o r t   H e l p   L i n k < / R e p o r t H e l p L i n k > - 
-         < / R e p o r t M e t a d a t a > - 
-         < R e p o r t R e q u e s t > - 
-             < T e n a n t E n t r a I d > T e n a n t   E n t r a   I d < / T e n a n t E n t r a I d > - 
-             < E n v i r o n m e n t N a m e > E n v i r o n m e n t   N a m e < / E n v i r o n m e n t N a m e > - 
-             < E n v i r o n m e n t T y p e > E n v i r o n m e n t   T y p e < / E n v i r o n m e n t T y p e > - 
-             < C o m p a n y N a m e > C o m p a n y   N a m e < / C o m p a n y N a m e > - 
-             < C o m p a n y D i s p l a y N a m e > C o m p a n y   D i s p l a y   N a m e < / C o m p a n y D i s p l a y N a m e > - 
-             < C o m p a n y I d > C o m p a n y   I D < / C o m p a n y I d > - 
-             < U s e r N a m e > U s e r   N a m e < / U s e r N a m e > - 
-             < D a t e A n d T i m e > D a t e   a n d   T i m e < / D a t e A n d T i m e > - 
-             < L a n g u a g e > L a n g u a g e < / L a n g u a g e > - 
-             < F o r m a t R e g i o n > F o r m a t   R e g i o n < / F o r m a t R e g i o n > - 
-             < D a t e T i m e V a l u e s > - 
-                 < Y e a r > Y e a r < / Y e a r > - 
-                 < M o n t h N u m b e r > M o n t h   N u m b e r < / M o n t h N u m b e r > - 
-                 < D a y N u m b e r > D a y   N u m b e r < / D a y N u m b e r > - 
-                 < H o u r > H o u r < / H o u r > - 
-                 < M i n u t e > M i n u t e < / M i n u t e > - 
-             < / D a t e T i m e V a l u e s > - 
-         < / R e p o r t R e q u e s t > - 
-         < C o m p a n y M e t a d a t a > - 
-             < C o m p a n y N a m e > C o m p a n y   N a m e < / C o m p a n y N a m e > - 
-             < C o m p a n y D i s p l a y N a m e > C o m p a n y   D i s p l a y   N a m e < / C o m p a n y D i s p l a y N a m e > - 
-             < C o m p a n y A d d r e s s L i n e s > - 
-                 < C o m p a n y A d d r e s s L i n e 1 > C o m p a n y   A d d r e s s   L i n e   1 < / C o m p a n y A d d r e s s L i n e 1 > - 
-                 < C o m p a n y A d d r e s s L i n e 2 > C o m p a n y   A d d r e s s   L i n e   2 < / C o m p a n y A d d r e s s L i n e 2 > - 
-                 < C o m p a n y A d d r e s s L i n e 3 > C o m p a n y   A d d r e s s   L i n e   3 < / C o m p a n y A d d r e s s L i n e 3 > - 
-                 < C o m p a n y A d d r e s s L i n e 4 > C o m p a n y   A d d r e s s   L i n e   4 < / C o m p a n y A d d r e s s L i n e 4 > - 
-                 < C o m p a n y A d d r e s s L i n e 5 > C o m p a n y   A d d r e s s   L i n e   5 < / C o m p a n y A d d r e s s L i n e 5 > - 
-                 < C o m p a n y A d d r e s s L i n e 6 > C o m p a n y   A d d r e s s   L i n e   6 < / C o m p a n y A d d r e s s L i n e 6 > - 
-                 < C o m p a n y A d d r e s s L i n e 7 > C o m p a n y   A d d r e s s   L i n e   7 < / C o m p a n y A d d r e s s L i n e 7 > - 
-                 < C o m p a n y A d d r e s s L i n e 8 > C o m p a n y   A d d r e s s   L i n e   8 < / C o m p a n y A d d r e s s L i n e 8 > - 
-             < / C o m p a n y A d d r e s s L i n e s > - 
-             < C o m p a n y P h o n e > C o m p a n y   P h o n e < / C o m p a n y P h o n e > - 
-             < C o m p a n y P h o n e C a p t i o n > C o m p a n y   P h o n e   C a p t i o n < / C o m p a n y P h o n e C a p t i o n > - 
-             < C o m p a n y F a x N o > C o m p a n y   F a x   N o . < / C o m p a n y F a x N o > - 
-             < C o m p a n y F a x N o C a p t i o n > C o m p a n y   F a x   N o .   C a p t i o n < / C o m p a n y F a x N o C a p t i o n > - 
-             < C o m p a n y E m a i l > C o m p a n y   E m a i l < / C o m p a n y E m a i l > - 
-             < C o m p a n y E m a i l C a p t i o n > C o m p a n y   E m a i l   C a p t i o n < / C o m p a n y E m a i l C a p t i o n > - 
-             < C o m p a n y H o m e P a g e > C o m p a n y   H o m e   P a g e < / C o m p a n y H o m e P a g e > - 
-             < C o m p a n y H o m e P a g e C a p t i o n > C o m p a n y   H o m e   P a g e   C a p t i o n < / C o m p a n y H o m e P a g e C a p t i o n > - 
-             < C o m p a n y L o g o > C o m p a n y   L o g o < / C o m p a n y L o g o > - 
-             < C o m p a n y V A T R e g i s t r a t i o n N o > C o m p a n y   V A T   R e g i s t r a t i o n   N o . < / C o m p a n y V A T R e g i s t r a t i o n N o > - 
-             < C o m p a n y V A T R e g i s t r a t i o n N o C a p t i o n > C o m p a n y   V A T   R e g i s t r a t i o n   N o .   C a p t i o n < / C o m p a n y V A T R e g i s t r a t i o n N o C a p t i o n > - 
-             < C o m p a n y R e g i s t r a t i o n N o > C o m p a n y   R e g i s t r a t i o n   N o . < / C o m p a n y R e g i s t r a t i o n N o > - 
-             < C o m p a n y R e g i s t r a t i o n N o C a p t i o n > C o m p a n y   R e g i s t r a t i o n   N o .   C a p t i o n < / C o m p a n y R e g i s t r a t i o n N o C a p t i o n > - 
-             < C o m p a n y B a n k N a m e > C o m p a n y   B a n k   N a m e < / C o m p a n y B a n k N a m e > - 
-             < C o m p a n y B a n k N a m e C a p t i o n > C o m p a n y   B a n k   N a m e   C a p t i o n < / C o m p a n y B a n k N a m e C a p t i o n > - 
-             < C o m p a n y B a n k A c c o u n t N o > C o m p a n y   B a n k   A c c o u n t   N o . < / C o m p a n y B a n k A c c o u n t N o > - 
-             < C o m p a n y B a n k A c c o u n t N o C a p t i o n > C o m p a n y   B a n k   A c c o u n t   N o .   C a p t i o n < / C o m p a n y B a n k A c c o u n t N o C a p t i o n > - 
-             < C o m p a n y B a n k B r a n c h N o > C o m p a n y   B a n k   B r a n c h   N o . < / C o m p a n y B a n k B r a n c h N o > - 
-             < C o m p a n y B a n k B r a n c h N o C a p t i o n > C o m p a n y   B a n k   B r a n c h   N o .   C a p t i o n < / C o m p a n y B a n k B r a n c h N o C a p t i o n > - 
-             < C o m p a n y I B A N > C o m p a n y   I B A N < / C o m p a n y I B A N > - 
-             < C o m p a n y I B A N C a p t i o n > C o m p a n y   I B A N   C a p t i o n < / C o m p a n y I B A N C a p t i o n > - 
-             < C o m p a n y B a n k S W I F T > C o m p a n y   B a n k   S W I F T < / C o m p a n y B a n k S W I F T > - 
-             < C o m p a n y B a n k S W I F T C a p t i o n > C o m p a n y   B a n k   S W I F T   C a p t i o n < / C o m p a n y B a n k S W I F T C a p t i o n > - 
-             < C o m p a n y G i r o N o > C o m p a n y   G i r o   N o . < / C o m p a n y G i r o N o > - 
-             < C o m p a n y G i r o N o C a p t i o n > C o m p a n y   G i r o   N o .   C a p t i o n < / C o m p a n y G i r o N o C a p t i o n > - 
-         < / C o m p a n y M e t a d a t a > - 
-     < / B C R e p o r t I n f o r m a t i o n > - 
-     < T o o l t i p s / > - 
- < / N a v W o r d R e p o r t X m l P a r t > 
-</file>
-
 <file path=customXml/item6.xml><?xml version="1.0" encoding="utf-8"?>
-<b:Sources xmlns:b="http://schemas.openxmlformats.org/officeDocument/2006/bibliography" xmlns="http://schemas.openxmlformats.org/officeDocument/2006/bibliography" SelectedStyle="\APASixthEditionOfficeOnline.xsl" StyleName="APA" Version="6"/>
+<p:properties xmlns:p="http://schemas.microsoft.com/office/2006/metadata/properties" xmlns:xsi="http://www.w3.org/2001/XMLSchema-instance" xmlns:pc="http://schemas.microsoft.com/office/infopath/2007/PartnerControls">
+  <documentManagement>
+    <Package xmlns="178f68d8-b893-4efd-8406-fab0f21873e4" xsi:nil="true"/>
+    <lcf76f155ced4ddcb4097134ff3c332f xmlns="178f68d8-b893-4efd-8406-fab0f21873e4">
+      <Terms xmlns="http://schemas.microsoft.com/office/infopath/2007/PartnerControls"/>
+    </lcf76f155ced4ddcb4097134ff3c332f>
+    <_ip_UnifiedCompliancePolicyUIAction xmlns="http://schemas.microsoft.com/sharepoint/v3" xsi:nil="true"/>
+    <TaxCatchAll xmlns="b83e059f-de16-406c-a902-3d56d4e79ec8" xsi:nil="true"/>
+    <Audience xmlns="178f68d8-b893-4efd-8406-fab0f21873e4" xsi:nil="true"/>
+    <_ip_UnifiedCompliancePolicyProperties xmlns="http://schemas.microsoft.com/sharepoint/v3" xsi:nil="true"/>
+    <DocumentType xmlns="178f68d8-b893-4efd-8406-fab0f21873e4" xsi:nil="true"/>
+  </documentManagement>
+</p:properties>
 </file>
 
 <file path=customXml/itemProps1.xml><?xml version="1.0" encoding="utf-8"?>
+<ds:datastoreItem xmlns:ds="http://schemas.openxmlformats.org/officeDocument/2006/customXml" ds:itemID="{7AEC2198-F042-4C71-9FA1-0766E4DE10D1}">
+  <ds:schemaRefs>
+    <ds:schemaRef ds:uri="http://schemas.microsoft.com/sharepoint/v3/contenttype/forms"/>
+  </ds:schemaRefs>
+</ds:datastoreItem>
+</file>
+
+<file path=customXml/itemProps2.xml><?xml version="1.0" encoding="utf-8"?>
 <ds:datastoreItem xmlns:ds="http://schemas.openxmlformats.org/officeDocument/2006/customXml" ds:itemID="{20B1C7BE-CC2E-41B2-B1D5-B0B8F36428EB}">
   <ds:schemaRefs>
     <ds:schemaRef ds:uri="urn:microsoft-dynamics-nav/reports/Tenant_Report_Defaults/2000000001/"/>
@@ -31547,27 +31561,23 @@
 </ds:datastoreItem>
 </file>
 
-<file path=customXml/itemProps2.xml><?xml version="1.0" encoding="utf-8"?>
-<ds:datastoreItem xmlns:ds="http://schemas.openxmlformats.org/officeDocument/2006/customXml" ds:itemID="{7AEC2198-F042-4C71-9FA1-0766E4DE10D1}">
+<file path=customXml/itemProps3.xml><?xml version="1.0" encoding="utf-8"?>
+<ds:datastoreItem xmlns:ds="http://schemas.openxmlformats.org/officeDocument/2006/customXml" ds:itemID="{89DB96BF-8133-438A-AAD3-A3C21079AEB1}">
   <ds:schemaRefs>
-    <ds:schemaRef ds:uri="http://schemas.microsoft.com/sharepoint/v3/contenttype/forms"/>
-  </ds:schemaRefs>
-</ds:datastoreItem>
-</file>
-
-<file path=customXml/itemProps3.xml><?xml version="1.0" encoding="utf-8"?>
-<ds:datastoreItem xmlns:ds="http://schemas.openxmlformats.org/officeDocument/2006/customXml" ds:itemID="{A86F1D83-C9A8-49B5-A7A4-4B754CFBD1D9}">
-  <ds:schemaRefs>
-    <ds:schemaRef ds:uri="http://schemas.microsoft.com/office/2006/metadata/properties"/>
-    <ds:schemaRef ds:uri="http://schemas.microsoft.com/office/infopath/2007/PartnerControls"/>
-    <ds:schemaRef ds:uri="178f68d8-b893-4efd-8406-fab0f21873e4"/>
-    <ds:schemaRef ds:uri="http://schemas.microsoft.com/sharepoint/v3"/>
-    <ds:schemaRef ds:uri="b83e059f-de16-406c-a902-3d56d4e79ec8"/>
+    <ds:schemaRef ds:uri="http://schemas.openxmlformats.org/officeDocument/2006/bibliography"/>
   </ds:schemaRefs>
 </ds:datastoreItem>
 </file>
 
 <file path=customXml/itemProps4.xml><?xml version="1.0" encoding="utf-8"?>
+<ds:datastoreItem xmlns:ds="http://schemas.openxmlformats.org/officeDocument/2006/customXml" ds:itemID="{E02279C7-2801-4BF1-B032-710495FC8DAA}">
+  <ds:schemaRefs>
+    <ds:schemaRef ds:uri="urn:microsoft-dynamics-businesscentral/internal/extended/reports/Tenant_Report_Defaults/2000000001/"/>
+  </ds:schemaRefs>
+</ds:datastoreItem>
+</file>
+
+<file path=customXml/itemProps5.xml><?xml version="1.0" encoding="utf-8"?>
 <ds:datastoreItem xmlns:ds="http://schemas.openxmlformats.org/officeDocument/2006/customXml" ds:itemID="{0FFE40E4-CA26-441C-A1D4-EB398D712217}">
   <ds:schemaRefs>
     <ds:schemaRef ds:uri="http://schemas.microsoft.com/office/2006/metadata/contentType"/>
@@ -31587,18 +31597,14 @@
 </ds:datastoreItem>
 </file>
 
-<file path=customXml/itemProps5.xml><?xml version="1.0" encoding="utf-8"?>
-<ds:datastoreItem xmlns:ds="http://schemas.openxmlformats.org/officeDocument/2006/customXml" ds:itemID="{E02279C7-2801-4BF1-B032-710495FC8DAA}">
+<file path=customXml/itemProps6.xml><?xml version="1.0" encoding="utf-8"?>
+<ds:datastoreItem xmlns:ds="http://schemas.openxmlformats.org/officeDocument/2006/customXml" ds:itemID="{A86F1D83-C9A8-49B5-A7A4-4B754CFBD1D9}">
   <ds:schemaRefs>
-    <ds:schemaRef ds:uri="urn:microsoft-dynamics-businesscentral/internal/extended/reports/Tenant_Report_Defaults/2000000001/"/>
-  </ds:schemaRefs>
-</ds:datastoreItem>
-</file>
-
-<file path=customXml/itemProps6.xml><?xml version="1.0" encoding="utf-8"?>
-<ds:datastoreItem xmlns:ds="http://schemas.openxmlformats.org/officeDocument/2006/customXml" ds:itemID="{89DB96BF-8133-438A-AAD3-A3C21079AEB1}">
-  <ds:schemaRefs>
-    <ds:schemaRef ds:uri="http://schemas.openxmlformats.org/officeDocument/2006/bibliography"/>
+    <ds:schemaRef ds:uri="http://schemas.microsoft.com/office/2006/metadata/properties"/>
+    <ds:schemaRef ds:uri="http://schemas.microsoft.com/office/infopath/2007/PartnerControls"/>
+    <ds:schemaRef ds:uri="178f68d8-b893-4efd-8406-fab0f21873e4"/>
+    <ds:schemaRef ds:uri="http://schemas.microsoft.com/sharepoint/v3"/>
+    <ds:schemaRef ds:uri="b83e059f-de16-406c-a902-3d56d4e79ec8"/>
   </ds:schemaRefs>
 </ds:datastoreItem>
 </file>

</xml_diff>